<commit_message>
Feature DSSAT strawberry modeling and synchronize resume downloads
</commit_message>
<xml_diff>
--- a/downloads/James_Han_Agronomic_Systems_Modeling_Resume.docx
+++ b/downloads/James_Han_Agronomic_Systems_Modeling_Resume.docx
@@ -68,7 +68,49 @@
     </w:p>
     <w:p>
       <w:r>
-        <w:t>Agricultural scientist with a Ph.D. in crop modeling and industry experience translating crop physiology, phenology and soil-water processes into commercial decision tools. Developed and maintained 30 crop models and evaluated management effects in SALUS through sensitivity analysis and field-data comparisons. Combines Python and R, experimental validation, agricultural data engineering and clear technical reporting to support practical corn and soybean decisions.</w:t>
+        <w:t>Agricultural scientist with a Ph.D. in crop modeling who implements DSSAT/CROPGRO-Strawberry processes in Python and develops crop models for practical agricultural decisions. Developed and maintained 30 commercial crop models, including corn and soybean, and built CornSoyWater irrigation decision support. Combines Python and R, crop physiology and phenology, field-data validation, management sensitivity analysis and agricultural data engineering to turn model behavior into usable tools and clear technical reports.</w:t>
+      </w:r>
+    </w:p>
+    <w:p>
+      <w:pPr>
+        <w:pStyle w:val="Heading1"/>
+      </w:pPr>
+      <w:r>
+        <w:t>SELECTED TECHNICAL PROJECTS</w:t>
+      </w:r>
+    </w:p>
+    <w:p>
+      <w:pPr>
+        <w:pStyle w:val="ListBullet"/>
+      </w:pPr>
+      <w:hyperlink r:id="rId12">
+        <w:r>
+          <w:rPr>
+            <w:color w:val="000000"/>
+            <w:u w:val="single"/>
+          </w:rPr>
+          <w:t>DSSAT/CROPGRO-Strawberry in Python</w:t>
+        </w:r>
+      </w:hyperlink>
+      <w:r>
+        <w:t>: Implemented DSSAT/CROPGRO-Strawberry processes in Python to simulate thermal-time phenology, canopy photosynthesis, biomass allocation and fruit development; built utilities to read DSSAT inputs and compare Python outputs with the Fortran model.</w:t>
+      </w:r>
+    </w:p>
+    <w:p>
+      <w:pPr>
+        <w:pStyle w:val="ListBullet"/>
+      </w:pPr>
+      <w:hyperlink r:id="rId13">
+        <w:r>
+          <w:rPr>
+            <w:color w:val="000000"/>
+            <w:u w:val="single"/>
+          </w:rPr>
+          <w:t>Blueberry maturity detection</w:t>
+        </w:r>
+      </w:hyperlink>
+      <w:r>
+        <w:t>: Built a crop-imagery application with YOLO, CPU inference in ONNX Runtime, batch processing, maturity counts and CSV export; connected model development to a usable web tool.</w:t>
       </w:r>
     </w:p>
     <w:p>
@@ -87,7 +129,7 @@
         <w:t xml:space="preserve">Crop modeling: </w:t>
       </w:r>
       <w:r>
-        <w:t>SALUS, process-based simulation, corn and soybean phenology, soil-water balance, nutrient and residue processes, management sensitivity, calibration and validation</w:t>
+        <w:t>DSSAT/CROPGRO-Strawberry (Python implementation), APSIM (workshop and hands-on experience), process-based simulation, corn and soybean phenology, soil-water balance, nutrient and residue processes, management sensitivity, calibration and validation, SALUS</w:t>
       </w:r>
     </w:p>
     <w:p>
@@ -172,6 +214,16 @@
     </w:p>
     <w:p>
       <w:pPr>
+        <w:pStyle w:val="Heading1"/>
+        <w:pageBreakBefore/>
+        <w:spacing w:before="0"/>
+      </w:pPr>
+      <w:r>
+        <w:t>INDUSTRY EXPERIENCE CONTINUED</w:t>
+      </w:r>
+    </w:p>
+    <w:p>
+      <w:pPr>
         <w:pStyle w:val="Heading2"/>
         <w:keepNext/>
       </w:pPr>
@@ -215,8 +267,8 @@
     <w:p>
       <w:pPr>
         <w:pStyle w:val="Heading1"/>
-        <w:pageBreakBefore/>
-        <w:spacing w:before="0"/>
+        <w:pageBreakBefore w:val="0"/>
+        <w:spacing w:before="180"/>
       </w:pPr>
       <w:r>
         <w:t>EARLIER INDUSTRY EXPERIENCE</w:t>
@@ -349,7 +401,7 @@
       <w:r>
         <w:t xml:space="preserve">, 109454. </w:t>
       </w:r>
-      <w:hyperlink r:id="rId12">
+      <w:hyperlink r:id="rId14">
         <w:r>
           <w:rPr>
             <w:color w:val="000000"/>
@@ -366,7 +418,7 @@
       <w:r>
         <w:t xml:space="preserve">System and method for adjusting irrigation system scheduling based on estimated soil water depletion. </w:t>
       </w:r>
-      <w:hyperlink r:id="rId13">
+      <w:hyperlink r:id="rId15">
         <w:r>
           <w:rPr>
             <w:color w:val="000000"/>
@@ -409,28 +461,6 @@
       <w:r>
         <w:br/>
         <w:t>University of Nebraska-Lincoln</w:t>
-      </w:r>
-    </w:p>
-    <w:p>
-      <w:pPr>
-        <w:pStyle w:val="Heading1"/>
-      </w:pPr>
-      <w:r>
-        <w:t>SELECTED APPLIED PROJECT</w:t>
-      </w:r>
-    </w:p>
-    <w:p>
-      <w:hyperlink r:id="rId14">
-        <w:r>
-          <w:rPr>
-            <w:color w:val="000000"/>
-            <w:u w:val="single"/>
-          </w:rPr>
-          <w:t>Blueberry maturity detection</w:t>
-        </w:r>
-      </w:hyperlink>
-      <w:r>
-        <w:t>: Built a crop-imagery application with YOLO, CPU inference in ONNX Runtime, batch processing, maturity counts and CSV export; connected model development to a usable web tool.</w:t>
       </w:r>
     </w:p>
     <w:sectPr>

</xml_diff>

<commit_message>
Update resume with prominent portfolio link
</commit_message>
<xml_diff>
--- a/downloads/James_Han_Agronomic_Systems_Modeling_Resume.docx
+++ b/downloads/James_Han_Agronomic_Systems_Modeling_Resume.docx
@@ -22,7 +22,27 @@
       <w:pPr>
         <w:pStyle w:val="Subtitle"/>
       </w:pPr>
+      <w:r>
+        <w:rPr>
+          <w:b/>
+        </w:rPr>
+        <w:t xml:space="preserve">Portfolio: </w:t>
+      </w:r>
       <w:hyperlink r:id="rId9">
+        <w:r>
+          <w:rPr>
+            <w:color w:val="000000"/>
+            <w:u w:val="single"/>
+          </w:rPr>
+          <w:t>itsjameshan.github.io</w:t>
+        </w:r>
+      </w:hyperlink>
+    </w:p>
+    <w:p>
+      <w:pPr>
+        <w:pStyle w:val="Subtitle"/>
+      </w:pPr>
+      <w:hyperlink r:id="rId10">
         <w:r>
           <w:rPr>
             <w:color w:val="000000"/>
@@ -36,7 +56,7 @@
       <w:pPr>
         <w:pStyle w:val="Subtitle"/>
       </w:pPr>
-      <w:hyperlink r:id="rId10">
+      <w:hyperlink r:id="rId11">
         <w:r>
           <w:rPr>
             <w:color w:val="000000"/>
@@ -48,7 +68,7 @@
       <w:r>
         <w:t xml:space="preserve"> | </w:t>
       </w:r>
-      <w:hyperlink r:id="rId11">
+      <w:hyperlink r:id="rId12">
         <w:r>
           <w:rPr>
             <w:color w:val="000000"/>
@@ -83,7 +103,7 @@
       <w:pPr>
         <w:pStyle w:val="ListBullet"/>
       </w:pPr>
-      <w:hyperlink r:id="rId12">
+      <w:hyperlink r:id="rId13">
         <w:r>
           <w:rPr>
             <w:color w:val="000000"/>
@@ -100,7 +120,7 @@
       <w:pPr>
         <w:pStyle w:val="ListBullet"/>
       </w:pPr>
-      <w:hyperlink r:id="rId13">
+      <w:hyperlink r:id="rId14">
         <w:r>
           <w:rPr>
             <w:color w:val="000000"/>
@@ -401,7 +421,7 @@
       <w:r>
         <w:t xml:space="preserve">, 109454. </w:t>
       </w:r>
-      <w:hyperlink r:id="rId14">
+      <w:hyperlink r:id="rId15">
         <w:r>
           <w:rPr>
             <w:color w:val="000000"/>
@@ -418,7 +438,7 @@
       <w:r>
         <w:t xml:space="preserve">System and method for adjusting irrigation system scheduling based on estimated soil water depletion. </w:t>
       </w:r>
-      <w:hyperlink r:id="rId15">
+      <w:hyperlink r:id="rId16">
         <w:r>
           <w:rPr>
             <w:color w:val="000000"/>

</xml_diff>

<commit_message>
Add contact icons to resume downloads
</commit_message>
<xml_diff>
--- a/downloads/James_Han_Agronomic_Systems_Modeling_Resume.docx
+++ b/downloads/James_Han_Agronomic_Systems_Modeling_Resume.docx
@@ -42,7 +42,44 @@
       <w:pPr>
         <w:pStyle w:val="Subtitle"/>
       </w:pPr>
-      <w:hyperlink r:id="rId10">
+      <w:r>
+        <w:drawing>
+          <wp:inline xmlns:a="http://schemas.openxmlformats.org/drawingml/2006/main" xmlns:pic="http://schemas.openxmlformats.org/drawingml/2006/picture">
+            <wp:extent cx="133350" cy="133350"/>
+            <wp:docPr id="1" name="Picture 1" descr="Email contact icon" title="Email icon"/>
+            <wp:cNvGraphicFramePr>
+              <a:graphicFrameLocks noChangeAspect="1"/>
+            </wp:cNvGraphicFramePr>
+            <a:graphic>
+              <a:graphicData uri="http://schemas.openxmlformats.org/drawingml/2006/picture">
+                <pic:pic>
+                  <pic:nvPicPr>
+                    <pic:cNvPr id="0" name="email.png"/>
+                    <pic:cNvPicPr/>
+                  </pic:nvPicPr>
+                  <pic:blipFill>
+                    <a:blip r:embed="rId10"/>
+                    <a:stretch>
+                      <a:fillRect/>
+                    </a:stretch>
+                  </pic:blipFill>
+                  <pic:spPr>
+                    <a:xfrm>
+                      <a:off x="0" y="0"/>
+                      <a:ext cx="133350" cy="133350"/>
+                    </a:xfrm>
+                    <a:prstGeom prst="rect"/>
+                  </pic:spPr>
+                </pic:pic>
+              </a:graphicData>
+            </a:graphic>
+          </wp:inline>
+        </w:drawing>
+      </w:r>
+      <w:r>
+        <w:t xml:space="preserve"> Email: </w:t>
+      </w:r>
+      <w:hyperlink r:id="rId11">
         <w:r>
           <w:rPr>
             <w:color w:val="000000"/>
@@ -56,7 +93,44 @@
       <w:pPr>
         <w:pStyle w:val="Subtitle"/>
       </w:pPr>
-      <w:hyperlink r:id="rId11">
+      <w:r>
+        <w:drawing>
+          <wp:inline xmlns:a="http://schemas.openxmlformats.org/drawingml/2006/main" xmlns:pic="http://schemas.openxmlformats.org/drawingml/2006/picture">
+            <wp:extent cx="133350" cy="133350"/>
+            <wp:docPr id="2" name="Picture 2" descr="LinkedIn contact icon" title="LinkedIn icon"/>
+            <wp:cNvGraphicFramePr>
+              <a:graphicFrameLocks noChangeAspect="1"/>
+            </wp:cNvGraphicFramePr>
+            <a:graphic>
+              <a:graphicData uri="http://schemas.openxmlformats.org/drawingml/2006/picture">
+                <pic:pic>
+                  <pic:nvPicPr>
+                    <pic:cNvPr id="0" name="linkedin.png"/>
+                    <pic:cNvPicPr/>
+                  </pic:nvPicPr>
+                  <pic:blipFill>
+                    <a:blip r:embed="rId12"/>
+                    <a:stretch>
+                      <a:fillRect/>
+                    </a:stretch>
+                  </pic:blipFill>
+                  <pic:spPr>
+                    <a:xfrm>
+                      <a:off x="0" y="0"/>
+                      <a:ext cx="133350" cy="133350"/>
+                    </a:xfrm>
+                    <a:prstGeom prst="rect"/>
+                  </pic:spPr>
+                </pic:pic>
+              </a:graphicData>
+            </a:graphic>
+          </wp:inline>
+        </w:drawing>
+      </w:r>
+      <w:r>
+        <w:t xml:space="preserve"> LinkedIn: </w:t>
+      </w:r>
+      <w:hyperlink r:id="rId13">
         <w:r>
           <w:rPr>
             <w:color w:val="000000"/>
@@ -68,7 +142,44 @@
       <w:r>
         <w:t xml:space="preserve"> | </w:t>
       </w:r>
-      <w:hyperlink r:id="rId12">
+      <w:r>
+        <w:drawing>
+          <wp:inline xmlns:a="http://schemas.openxmlformats.org/drawingml/2006/main" xmlns:pic="http://schemas.openxmlformats.org/drawingml/2006/picture">
+            <wp:extent cx="133350" cy="133350"/>
+            <wp:docPr id="3" name="Picture 3" descr="GitHub contact icon" title="GitHub icon"/>
+            <wp:cNvGraphicFramePr>
+              <a:graphicFrameLocks noChangeAspect="1"/>
+            </wp:cNvGraphicFramePr>
+            <a:graphic>
+              <a:graphicData uri="http://schemas.openxmlformats.org/drawingml/2006/picture">
+                <pic:pic>
+                  <pic:nvPicPr>
+                    <pic:cNvPr id="0" name="github.png"/>
+                    <pic:cNvPicPr/>
+                  </pic:nvPicPr>
+                  <pic:blipFill>
+                    <a:blip r:embed="rId14"/>
+                    <a:stretch>
+                      <a:fillRect/>
+                    </a:stretch>
+                  </pic:blipFill>
+                  <pic:spPr>
+                    <a:xfrm>
+                      <a:off x="0" y="0"/>
+                      <a:ext cx="133350" cy="133350"/>
+                    </a:xfrm>
+                    <a:prstGeom prst="rect"/>
+                  </pic:spPr>
+                </pic:pic>
+              </a:graphicData>
+            </a:graphic>
+          </wp:inline>
+        </w:drawing>
+      </w:r>
+      <w:r>
+        <w:t xml:space="preserve"> GitHub: </w:t>
+      </w:r>
+      <w:hyperlink r:id="rId15">
         <w:r>
           <w:rPr>
             <w:color w:val="000000"/>
@@ -103,7 +214,7 @@
       <w:pPr>
         <w:pStyle w:val="ListBullet"/>
       </w:pPr>
-      <w:hyperlink r:id="rId13">
+      <w:hyperlink r:id="rId16">
         <w:r>
           <w:rPr>
             <w:color w:val="000000"/>
@@ -120,7 +231,7 @@
       <w:pPr>
         <w:pStyle w:val="ListBullet"/>
       </w:pPr>
-      <w:hyperlink r:id="rId14">
+      <w:hyperlink r:id="rId17">
         <w:r>
           <w:rPr>
             <w:color w:val="000000"/>
@@ -421,7 +532,7 @@
       <w:r>
         <w:t xml:space="preserve">, 109454. </w:t>
       </w:r>
-      <w:hyperlink r:id="rId15">
+      <w:hyperlink r:id="rId18">
         <w:r>
           <w:rPr>
             <w:color w:val="000000"/>
@@ -438,7 +549,7 @@
       <w:r>
         <w:t xml:space="preserve">System and method for adjusting irrigation system scheduling based on estimated soil water depletion. </w:t>
       </w:r>
-      <w:hyperlink r:id="rId16">
+      <w:hyperlink r:id="rId19">
         <w:r>
           <w:rPr>
             <w:color w:val="000000"/>

</xml_diff>

<commit_message>
Update resume portfolio and GitHub icons
</commit_message>
<xml_diff>
--- a/downloads/James_Han_Agronomic_Systems_Modeling_Resume.docx
+++ b/downloads/James_Han_Agronomic_Systems_Modeling_Resume.docx
@@ -23,12 +23,46 @@
         <w:pStyle w:val="Subtitle"/>
       </w:pPr>
       <w:r>
+        <w:drawing>
+          <wp:inline xmlns:a="http://schemas.openxmlformats.org/drawingml/2006/main" xmlns:pic="http://schemas.openxmlformats.org/drawingml/2006/picture">
+            <wp:extent cx="133350" cy="133350"/>
+            <wp:docPr id="1" name="Picture 1" descr="Portfolio website icon" title="Portfolio icon"/>
+            <wp:cNvGraphicFramePr>
+              <a:graphicFrameLocks noChangeAspect="1"/>
+            </wp:cNvGraphicFramePr>
+            <a:graphic>
+              <a:graphicData uri="http://schemas.openxmlformats.org/drawingml/2006/picture">
+                <pic:pic>
+                  <pic:nvPicPr>
+                    <pic:cNvPr id="0" name="portfolio.png"/>
+                    <pic:cNvPicPr/>
+                  </pic:nvPicPr>
+                  <pic:blipFill>
+                    <a:blip r:embed="rId9"/>
+                    <a:stretch>
+                      <a:fillRect/>
+                    </a:stretch>
+                  </pic:blipFill>
+                  <pic:spPr>
+                    <a:xfrm>
+                      <a:off x="0" y="0"/>
+                      <a:ext cx="133350" cy="133350"/>
+                    </a:xfrm>
+                    <a:prstGeom prst="rect"/>
+                  </pic:spPr>
+                </pic:pic>
+              </a:graphicData>
+            </a:graphic>
+          </wp:inline>
+        </w:drawing>
+      </w:r>
+      <w:r>
         <w:rPr>
           <w:b/>
         </w:rPr>
         <w:t xml:space="preserve">Portfolio: </w:t>
       </w:r>
-      <w:hyperlink r:id="rId9">
+      <w:hyperlink r:id="rId10">
         <w:r>
           <w:rPr>
             <w:b/>
@@ -47,7 +81,7 @@
         <w:drawing>
           <wp:inline xmlns:a="http://schemas.openxmlformats.org/drawingml/2006/main" xmlns:pic="http://schemas.openxmlformats.org/drawingml/2006/picture">
             <wp:extent cx="133350" cy="133350"/>
-            <wp:docPr id="1" name="Picture 1" descr="Email contact icon" title="Email icon"/>
+            <wp:docPr id="2" name="Picture 2" descr="Email contact icon" title="Email icon"/>
             <wp:cNvGraphicFramePr>
               <a:graphicFrameLocks noChangeAspect="1"/>
             </wp:cNvGraphicFramePr>
@@ -59,7 +93,7 @@
                     <pic:cNvPicPr/>
                   </pic:nvPicPr>
                   <pic:blipFill>
-                    <a:blip r:embed="rId10"/>
+                    <a:blip r:embed="rId11"/>
                     <a:stretch>
                       <a:fillRect/>
                     </a:stretch>
@@ -80,7 +114,7 @@
       <w:r>
         <w:t xml:space="preserve"> Email: </w:t>
       </w:r>
-      <w:hyperlink r:id="rId11">
+      <w:hyperlink r:id="rId12">
         <w:r>
           <w:rPr>
             <w:color w:val="000000"/>
@@ -98,7 +132,7 @@
         <w:drawing>
           <wp:inline xmlns:a="http://schemas.openxmlformats.org/drawingml/2006/main" xmlns:pic="http://schemas.openxmlformats.org/drawingml/2006/picture">
             <wp:extent cx="133350" cy="133350"/>
-            <wp:docPr id="2" name="Picture 2" descr="LinkedIn contact icon" title="LinkedIn icon"/>
+            <wp:docPr id="3" name="Picture 3" descr="LinkedIn contact icon" title="LinkedIn icon"/>
             <wp:cNvGraphicFramePr>
               <a:graphicFrameLocks noChangeAspect="1"/>
             </wp:cNvGraphicFramePr>
@@ -110,7 +144,7 @@
                     <pic:cNvPicPr/>
                   </pic:nvPicPr>
                   <pic:blipFill>
-                    <a:blip r:embed="rId12"/>
+                    <a:blip r:embed="rId13"/>
                     <a:stretch>
                       <a:fillRect/>
                     </a:stretch>
@@ -131,7 +165,7 @@
       <w:r>
         <w:t xml:space="preserve"> LinkedIn: </w:t>
       </w:r>
-      <w:hyperlink r:id="rId13">
+      <w:hyperlink r:id="rId14">
         <w:r>
           <w:rPr>
             <w:color w:val="000000"/>
@@ -146,8 +180,8 @@
       <w:r>
         <w:drawing>
           <wp:inline xmlns:a="http://schemas.openxmlformats.org/drawingml/2006/main" xmlns:pic="http://schemas.openxmlformats.org/drawingml/2006/picture">
-            <wp:extent cx="133350" cy="133350"/>
-            <wp:docPr id="3" name="Picture 3" descr="GitHub contact icon" title="GitHub icon"/>
+            <wp:extent cx="133350" cy="130629"/>
+            <wp:docPr id="4" name="Picture 4" descr="GitHub contact icon" title="GitHub icon"/>
             <wp:cNvGraphicFramePr>
               <a:graphicFrameLocks noChangeAspect="1"/>
             </wp:cNvGraphicFramePr>
@@ -159,7 +193,7 @@
                     <pic:cNvPicPr/>
                   </pic:nvPicPr>
                   <pic:blipFill>
-                    <a:blip r:embed="rId14"/>
+                    <a:blip r:embed="rId15"/>
                     <a:stretch>
                       <a:fillRect/>
                     </a:stretch>
@@ -167,7 +201,7 @@
                   <pic:spPr>
                     <a:xfrm>
                       <a:off x="0" y="0"/>
-                      <a:ext cx="133350" cy="133350"/>
+                      <a:ext cx="133350" cy="130629"/>
                     </a:xfrm>
                     <a:prstGeom prst="rect"/>
                   </pic:spPr>
@@ -180,7 +214,7 @@
       <w:r>
         <w:t xml:space="preserve"> GitHub: </w:t>
       </w:r>
-      <w:hyperlink r:id="rId15">
+      <w:hyperlink r:id="rId16">
         <w:r>
           <w:rPr>
             <w:color w:val="000000"/>
@@ -215,7 +249,7 @@
       <w:pPr>
         <w:pStyle w:val="ListBullet"/>
       </w:pPr>
-      <w:hyperlink r:id="rId16">
+      <w:hyperlink r:id="rId17">
         <w:r>
           <w:rPr>
             <w:color w:val="000000"/>
@@ -232,7 +266,7 @@
       <w:pPr>
         <w:pStyle w:val="ListBullet"/>
       </w:pPr>
-      <w:hyperlink r:id="rId17">
+      <w:hyperlink r:id="rId18">
         <w:r>
           <w:rPr>
             <w:color w:val="000000"/>
@@ -533,7 +567,7 @@
       <w:r>
         <w:t xml:space="preserve">, 109454. </w:t>
       </w:r>
-      <w:hyperlink r:id="rId18">
+      <w:hyperlink r:id="rId19">
         <w:r>
           <w:rPr>
             <w:color w:val="000000"/>
@@ -550,7 +584,7 @@
       <w:r>
         <w:t xml:space="preserve">System and method for adjusting irrigation system scheduling based on estimated soil water depletion. </w:t>
       </w:r>
-      <w:hyperlink r:id="rId19">
+      <w:hyperlink r:id="rId20">
         <w:r>
           <w:rPr>
             <w:color w:val="000000"/>

</xml_diff>